<commit_message>
promote local -> dev (2026-07-22T02:20:59.572395+00:00)
</commit_message>
<xml_diff>
--- a/pipeline/ArchitectureDesignAndAudit/ProviderPipeline_LowLevelDesign_v33.docx
+++ b/pipeline/ArchitectureDesignAndAudit/ProviderPipeline_LowLevelDesign_v33.docx
@@ -4486,6 +4486,14 @@
           <w:color w:val="C00000"/>
         </w:rPr>
         <w:t>CLOUD-INIT (v33). Cloud-init installs docker.io and Azure CLI on boot (stock Ubuntu 24.04 has neither). Order: apt install docker.io + ca-certificates + curl + jq -&gt; systemctl enable docker -&gt; curl aka.ms/InstallAzureCLIDeb | bash -&gt; az login --identity -&gt; az acr login -&gt; docker pull image -&gt; docker run Controller. Runcmd tee's all output to /var/log/chpipeline-cloud-init.log for post-mortem.</w:t>
+      </w:r>
+    </w:p>
+    <w:p>
+      <w:r>
+        <w:rPr>
+          <w:color w:val="C00000"/>
+        </w:rPr>
+        <w:t>GAP (v33 post-issue): The docker run invocation in cloud-init MUST include -e CHATHEALTHY_NODE_IDENTITY='pipeline-control' (the long-lived-identity value from pipeline/Code/bootstrap.py). Absent this env var the Controller aborts at bootstrap with a FATAL message. The value is fixed; not derived from run parameters.</w:t>
       </w:r>
     </w:p>
     <w:p>

</xml_diff>

<commit_message>
promote local -> dev (2026-07-22T04:54:30.726394+00:00)
</commit_message>
<xml_diff>
--- a/pipeline/ArchitectureDesignAndAudit/ProviderPipeline_LowLevelDesign_v33.docx
+++ b/pipeline/ArchitectureDesignAndAudit/ProviderPipeline_LowLevelDesign_v33.docx
@@ -29005,6 +29005,70 @@
       </w:tr>
     </w:tbl>
     <w:p/>
+    <w:p>
+      <w:r>
+        <w:rPr>
+          <w:color w:val="C00000"/>
+        </w:rPr>
+        <w:t>[V33+ ADDITION] MongoUtilities.invalidate(env_var_name) [public API, git commit be697f75+]. Callers use this to rotate the URI mid-process (e.g. the pipeline runbook falls back from Atlas SRV to a DNS-over-HTTPS direct URI on SRV lookup failure). Prior version required poking at private _client_cache dict; that abstraction breach is closed.</w:t>
+      </w:r>
+    </w:p>
+    <w:p>
+      <w:r>
+        <w:rPr>
+          <w:color w:val="C00000"/>
+        </w:rPr>
+        <w:t>[V33+ ADDITION] Runbook creates reservation on front-cluster admin.cluster_lifecycle immediately after VM PUT succeeds. Reservation fields: {_id: run_id, run_id, vm_name, requester: provider_pipeline_runbook, start_time: NOW, expiry_at: NOW+10h, cluster_name, reservation_class: pipeline_run, pipeline_name: provider, status: active}. Expiry 10 hours = outer safety envelope (NOT a startup timeout). Controller inherits and DELETES the reservation in its main.finally as the primary release path. ReservationReaper is the safety net for expiry_at &lt; NOW.</w:t>
+      </w:r>
+    </w:p>
+    <w:p>
+      <w:r>
+        <w:rPr>
+          <w:color w:val="C00000"/>
+        </w:rPr>
+        <w:t>[V33+ ADDITION] Runbook finally on error path: if runbook errored AFTER creating the reservation and/or AFTER VM PUT, the finally MUST cancel the reservation AND issue az vm delete on the VM it created. _runbook_error_teardown() gates both actions on flags reservation_created and vm_provisioned so no cleanup runs on a state that never came into being.</w:t>
+      </w:r>
+    </w:p>
+    <w:p>
+      <w:r>
+        <w:rPr>
+          <w:color w:val="C00000"/>
+        </w:rPr>
+        <w:t>[V33+ ADDITION] Controller main.finally quiesce order (LLD v33 clarification): (a) delete reservation from admin.cluster_lifecycle, (b) update run manifest to status=(succeeded|failed) + ended_at in chathealthyfrontend.pipeline.runs, (c) fire az vm delete --no-wait on AZURE_VM_NAME. Mongo cleanup MUST complete before VM delete so any failure surfaces in Mongo before the machine that could have retried it is gone.</w:t>
+      </w:r>
+    </w:p>
+    <w:p>
+      <w:r>
+        <w:rPr>
+          <w:color w:val="C00000"/>
+        </w:rPr>
+        <w:t>[V33+ ADDITION] Watchdog reservation check (v33 §3.1.2 refinement): reads admin.cluster_lifecycle by _id=run_id. A row with expiry_at &gt; NOW is a live claim -&gt; Watchdog MUST NOT touch the VM regardless of manifest state. Missing row means Controller already finished or reservation was reaped; subsequent manifest/heartbeat/grace checks decide.</w:t>
+      </w:r>
+    </w:p>
+    <w:p>
+      <w:r>
+        <w:rPr>
+          <w:color w:val="C00000"/>
+        </w:rPr>
+        <w:t>[V33+ ADDITION] Deploy chain schedule wiring supports two name forms: SCH-&lt;Runbook&gt;-&lt;N&gt;(min|hour) for recurring intervals, SCH-&lt;Runbook&gt;-&lt;HHMM&gt;UTC for daily-at-fixed-time. Daily form rolls to tomorrow if today has passed or is within 10-min of NOW (Azure requires startTime &gt; NOW + 5min).</w:t>
+      </w:r>
+    </w:p>
+    <w:p>
+      <w:r>
+        <w:rPr>
+          <w:color w:val="C00000"/>
+        </w:rPr>
+        <w:t>[V33+ ADDITION] AA runbook code compliance mechanism (build-time inlined library): build_chain._inline_chathealthy_lib_if_used prepends a self-contained bootstrap block to each AA runbook file whose body imports from chathealthy_frontend_lib. Bootstrap block base64-decodes and exec-installs exceptions.py, mongo_utilities.py, logging_service.py into sys.modules. Bytes are read at build time from FrontEndApplicationLib/src/chathealthy_frontend_lib/*.py (git-committed source). No external package hosting; no wheel URL; every byte in the shipped runbook is derived from a git commit.</w:t>
+      </w:r>
+    </w:p>
+    <w:p>
+      <w:r>
+        <w:rPr>
+          <w:color w:val="C00000"/>
+        </w:rPr>
+        <w:t>[V33+ ADDITION] Runbook log() function is a thin delegate to ChatHealthyLoggingService.info(json.dumps(record)). Prior parallel Mongo write to chathealthyfrontend.logFileCollection is removed. Rule-005 mandates CHLS as canonical destination; the MongoLogHandler writes to Pipelines.Log_{env}. Single log path.</w:t>
+      </w:r>
+    </w:p>
     <w:sectPr>
       <w:pgSz w:w="12240" w:h="15840"/>
       <w:pgMar w:top="1440" w:right="1800" w:bottom="1440" w:left="1800" w:header="720" w:footer="720" w:gutter="0"/>

</xml_diff>

<commit_message>
promote local -> dev (2026-07-22T05:19:35.514726+00:00)
</commit_message>
<xml_diff>
--- a/pipeline/ArchitectureDesignAndAudit/ProviderPipeline_LowLevelDesign_v33.docx
+++ b/pipeline/ArchitectureDesignAndAudit/ProviderPipeline_LowLevelDesign_v33.docx
@@ -29069,6 +29069,62 @@
         <w:t>[V33+ ADDITION] Runbook log() function is a thin delegate to ChatHealthyLoggingService.info(json.dumps(record)). Prior parallel Mongo write to chathealthyfrontend.logFileCollection is removed. Rule-005 mandates CHLS as canonical destination; the MongoLogHandler writes to Pipelines.Log_{env}. Single log path.</w:t>
       </w:r>
     </w:p>
+    <w:p>
+      <w:r>
+        <w:rPr>
+          <w:color w:val="C00000"/>
+        </w:rPr>
+        <w:t>[V33+ ADDITION] ChatHealthyLoggingService (CHLS) init-time contract for missing Mongo env: _maybe_build_mongo_handler MUST return None (not raise) when any of MONGO_FRONTEND_connectionString / CH_SPACE_NAME / ENV_PREFIX is unset. On first missing-env encounter, one warning line is emitted to stderr; subsequent skips are silent. _ensure_configured leaves _mongo_handler_bound=False so the next log call after env is loaded rebinds and wires the Mongo handler live. Rationale: bootstrap code emits log events BEFORE the KV secret load populates Mongo env; a raise there would force bootstrap into a print()-based escape hatch, which is a Rule-005 violation. The 'if you can't log to Mongo you die' policy is enforced by PipelineServices.observability_gate.ObservabilityGate.check() as an active reachability probe; that gate — not passive handler construction — is the fatal signal for a running service.</w:t>
+      </w:r>
+    </w:p>
+    <w:p>
+      <w:r>
+        <w:rPr>
+          <w:color w:val="C00000"/>
+        </w:rPr>
+        <w:t>[V33+ ADDITION] Runbook _delete_vm_via_arm tolerates HTTP 404 (VM already gone) AND HTTP 409 (delete queued while another operation is in flight; ARM completes the delete once the in-flight operation finishes). Both are treated as success on the fire-and-forget teardown path. Any other 4xx/5xx re-raises so the caller can log + swallow. This makes runbook error-path teardown idempotent across every VM-lifecycle state (pending PUT, provisioning, running, deleting, gone).</w:t>
+      </w:r>
+    </w:p>
+    <w:p>
+      <w:r>
+        <w:rPr>
+          <w:color w:val="C00000"/>
+        </w:rPr>
+        <w:t>[V33+ ADDITION] Cloud-init docker run for pipeline-control container sets CH_LOG_LEVEL='INFO' (baseline). DEBUG is opt-in per-run via manifest override and is NEVER the default: DEBUG at the default rate would exhaust Mongo log-record write budget on Pipelines.Log_{env} within one full-corpus run. Debug-level triage runs use the manifest debug flag and are single-state or bounded.</w:t>
+      </w:r>
+    </w:p>
+    <w:p>
+      <w:r>
+        <w:rPr>
+          <w:color w:val="C00000"/>
+        </w:rPr>
+        <w:t>[V33+ ADDITION] Controller (control_runner.main) and Worker (worker_runner.main, pipeline_worker.main) --log-level CLI argument sets the LOG_LEVEL environment variable via os.environ.setdefault before any log call; ChatHealthyLoggingService._compute_level() reads that env var on _ensure_configured. Controller and Worker DO NOT construct stdlib logging handlers, DO NOT call CHLS().setLevel/.addHandler/.handlers, and DO NOT own any part of the handler wiring. CHLS is the sole handler owner across the entire pipeline execution surface (Rule-005 statement 4).</w:t>
+      </w:r>
+    </w:p>
+    <w:p>
+      <w:r>
+        <w:rPr>
+          <w:color w:val="C00000"/>
+        </w:rPr>
+        <w:t>[V33+ ADDITION] blob_logger.install(pipeline_name) is a thin bootstrap trigger that constructs ChatHealthyLoggingService() once and emits one info line naming the pipeline component. No stdlib logging.Handler subclass, no BlobAppendHandler, no per-day append-blob output. CHLS's file/stderr/Mongo handlers cover the observability surface (CH_LOG_DESTINATION for file/stderr, MongoLogHandler for Pipelines.Log_{env}). Prior append-blob per-day scheme is superseded; the docker container's stdout still flows to Log Analytics via ACA collection.</w:t>
+      </w:r>
+    </w:p>
+    <w:p>
+      <w:r>
+        <w:rPr>
+          <w:color w:val="C00000"/>
+        </w:rPr>
+        <w:t>[V33+ ADDITION] ChatHealthyMongoUtilities is imported at module top in Controller (pipeline/Code/control_runner.py) and Worker (pipeline/Code/pipeline_worker.py, worker_runner.py). Lazy in-function imports of pymongo or the utility MUST NOT be used. datetime module is imported and referenced directly (datetime.datetime.utcnow()); the __import__('datetime') runtime-import pattern MUST NOT be used. Rationale: single import surface makes Rule-005 statement-4 compliance mechanically checkable and eliminates dead lazy imports.</w:t>
+      </w:r>
+    </w:p>
+    <w:p>
+      <w:r>
+        <w:rPr>
+          <w:color w:val="C00000"/>
+        </w:rPr>
+        <w:t>[V33+ ADDITION] Pipeline abend and status output surface, Rule-005 alignment: no print() call is legitimate outside pipeline/Code/tests/**. Bootstrap observability-gate abend dumper (bootstrap.py:_dump_obs_abend), observability_gate._dump_to_stderr, and data_migrator runbook status mirrors (deprovisioner/provisioner/orchestrator/migrator) emit exclusively via ChatHealthyLoggingService.error() or .info(). AA job-stream capture is unchanged: CHLS's stderr handler feeds AA job streams the same content print()-to-stderr previously provided. Structured JSON status mirrors (formerly print(json.dumps(...))) are now log.info(json.dumps(...)), preserving the byte content while routing through CHLS's handler stack.</w:t>
+      </w:r>
+    </w:p>
     <w:sectPr>
       <w:pgSz w:w="12240" w:h="15840"/>
       <w:pgMar w:top="1440" w:right="1800" w:bottom="1440" w:left="1800" w:header="720" w:footer="720" w:gutter="0"/>

</xml_diff>